<commit_message>
atualização dos documentos .astah e visão
</commit_message>
<xml_diff>
--- a/doc/mcweb-visao.docx
+++ b/doc/mcweb-visao.docx
@@ -1,6 +1,6 @@
 
 <file path=word/document.xml><?xml version="1.0" encoding="utf-8"?>
-<w:document xmlns:wpc="http://schemas.microsoft.com/office/word/2010/wordprocessingCanvas" xmlns:cx="http://schemas.microsoft.com/office/drawing/2014/chartex" xmlns:cx1="http://schemas.microsoft.com/office/drawing/2015/9/8/chartex" xmlns:cx2="http://schemas.microsoft.com/office/drawing/2015/10/21/chartex" xmlns:cx3="http://schemas.microsoft.com/office/drawing/2016/5/9/chartex" xmlns:cx4="http://schemas.microsoft.com/office/drawing/2016/5/10/chartex" xmlns:cx5="http://schemas.microsoft.com/office/drawing/2016/5/11/chartex" xmlns:cx6="http://schemas.microsoft.com/office/drawing/2016/5/12/chartex" xmlns:cx7="http://schemas.microsoft.com/office/drawing/2016/5/13/chartex" xmlns:cx8="http://schemas.microsoft.com/office/drawing/2016/5/14/chartex" xmlns:mc="http://schemas.openxmlformats.org/markup-compatibility/2006" xmlns:aink="http://schemas.microsoft.com/office/drawing/2016/ink" xmlns:am3d="http://schemas.microsoft.com/office/drawing/2017/model3d" xmlns:o="urn:schemas-microsoft-com:office:office" xmlns:oel="http://schemas.microsoft.com/office/2019/extlst" xmlns:r="http://schemas.openxmlformats.org/officeDocument/2006/relationships" xmlns:m="http://schemas.openxmlformats.org/officeDocument/2006/math" xmlns:v="urn:schemas-microsoft-com:vml" xmlns:wp14="http://schemas.microsoft.com/office/word/2010/wordprocessingDrawing" xmlns:wp="http://schemas.openxmlformats.org/drawingml/2006/wordprocessingDrawing" xmlns:w10="urn:schemas-microsoft-com:office:word" xmlns:w="http://schemas.openxmlformats.org/wordprocessingml/2006/main" xmlns:w14="http://schemas.microsoft.com/office/word/2010/wordml" xmlns:w15="http://schemas.microsoft.com/office/word/2012/wordml" xmlns:w16cex="http://schemas.microsoft.com/office/word/2018/wordml/cex" xmlns:w16cid="http://schemas.microsoft.com/office/word/2016/wordml/cid" xmlns:w16="http://schemas.microsoft.com/office/word/2018/wordml" xmlns:w16du="http://schemas.microsoft.com/office/word/2023/wordml/word16du" xmlns:w16sdtdh="http://schemas.microsoft.com/office/word/2020/wordml/sdtdatahash" xmlns:w16sdtfl="http://schemas.microsoft.com/office/word/2024/wordml/sdtformatlock" xmlns:w16se="http://schemas.microsoft.com/office/word/2015/wordml/symex" xmlns:wpg="http://schemas.microsoft.com/office/word/2010/wordprocessingGroup" xmlns:wpi="http://schemas.microsoft.com/office/word/2010/wordprocessingInk" xmlns:wne="http://schemas.microsoft.com/office/word/2006/wordml" xmlns:wps="http://schemas.microsoft.com/office/word/2010/wordprocessingShape" mc:Ignorable="w14 w15 w16se w16cid w16 w16cex w16sdtdh w16sdtfl w16du wp14">
+<w:document xmlns:wpc="http://schemas.microsoft.com/office/word/2010/wordprocessingCanvas" xmlns:cx="http://schemas.microsoft.com/office/drawing/2014/chartex" xmlns:mc="http://schemas.openxmlformats.org/markup-compatibility/2006" xmlns:o="urn:schemas-microsoft-com:office:office" xmlns:r="http://schemas.openxmlformats.org/officeDocument/2006/relationships" xmlns:m="http://schemas.openxmlformats.org/officeDocument/2006/math" xmlns:v="urn:schemas-microsoft-com:vml" xmlns:wp14="http://schemas.microsoft.com/office/word/2010/wordprocessingDrawing" xmlns:wp="http://schemas.openxmlformats.org/drawingml/2006/wordprocessingDrawing" xmlns:w10="urn:schemas-microsoft-com:office:word" xmlns:w="http://schemas.openxmlformats.org/wordprocessingml/2006/main" xmlns:w14="http://schemas.microsoft.com/office/word/2010/wordml" xmlns:w15="http://schemas.microsoft.com/office/word/2012/wordml" xmlns:w16se="http://schemas.microsoft.com/office/word/2015/wordml/symex" xmlns:wpg="http://schemas.microsoft.com/office/word/2010/wordprocessingGroup" xmlns:wpi="http://schemas.microsoft.com/office/word/2010/wordprocessingInk" xmlns:wne="http://schemas.microsoft.com/office/word/2006/wordml" xmlns:wps="http://schemas.microsoft.com/office/word/2010/wordprocessingShape" mc:Ignorable="w14 w15 w16se wp14">
   <w:body>
     <w:bookmarkStart w:id="0" w:name="_Toc41559909" w:displacedByCustomXml="next"/>
     <w:sdt>
@@ -127,32 +127,6 @@
               <w:smallCaps/>
             </w:rPr>
             <w:t xml:space="preserve"> BELUFI</w:t>
-          </w:r>
-        </w:p>
-        <w:p>
-          <w:pPr>
-            <w:pBdr>
-              <w:top w:val="nil"/>
-              <w:left w:val="nil"/>
-              <w:bottom w:val="nil"/>
-              <w:right w:val="nil"/>
-              <w:between w:val="nil"/>
-            </w:pBdr>
-            <w:spacing w:after="0" w:line="240" w:lineRule="auto"/>
-            <w:jc w:val="center"/>
-            <w:rPr>
-              <w:rFonts w:ascii="Arial" w:eastAsia="Arial" w:hAnsi="Arial" w:cs="Arial"/>
-              <w:b/>
-              <w:smallCaps/>
-            </w:rPr>
-          </w:pPr>
-          <w:r>
-            <w:rPr>
-              <w:rFonts w:ascii="Arial" w:eastAsia="Arial" w:hAnsi="Arial" w:cs="Arial"/>
-              <w:b/>
-              <w:smallCaps/>
-            </w:rPr>
-            <w:t>LEONEL CARDOSO LEAL</w:t>
           </w:r>
         </w:p>
         <w:p>
@@ -1672,21 +1646,43 @@
         <w:rPr>
           <w:b w:val="0"/>
         </w:rPr>
-        <w:t xml:space="preserve">O projeto </w:t>
-      </w:r>
-      <w:proofErr w:type="spellStart"/>
+        <w:t>O projeto Medic</w:t>
+      </w:r>
       <w:r>
         <w:rPr>
           <w:b w:val="0"/>
         </w:rPr>
-        <w:t>Medic</w:t>
-      </w:r>
-      <w:proofErr w:type="spellEnd"/>
+        <w:t>al</w:t>
+      </w:r>
       <w:r>
         <w:rPr>
           <w:b w:val="0"/>
         </w:rPr>
-        <w:t xml:space="preserve"> Clinic Software propõe o desenvolvimento de um sistema web para clínicas médicas, visando a modernização e otimização do agendamento de consultas, gestão de prontuários e organização administrativa. A solução atende à necessidade crescente por informatização no setor da saúde, promovendo maior eficiência, segurança e comodidade para pacientes e profissionais</w:t>
+        <w:t xml:space="preserve"> Clinic Software propõe o desenvolvimento de um sistema web para</w:t>
+      </w:r>
+      <w:r>
+        <w:rPr>
+          <w:b w:val="0"/>
+        </w:rPr>
+        <w:t xml:space="preserve"> uma clínica medica</w:t>
+      </w:r>
+      <w:r>
+        <w:rPr>
+          <w:b w:val="0"/>
+        </w:rPr>
+        <w:t>, visando a modernização e otimização do agendamento de consultas, gestão de prontuár</w:t>
+      </w:r>
+      <w:r>
+        <w:rPr>
+          <w:b w:val="0"/>
+        </w:rPr>
+        <w:t>ios</w:t>
+      </w:r>
+      <w:r>
+        <w:rPr>
+          <w:b w:val="0"/>
+        </w:rPr>
+        <w:t>. A solução atende à necessidade crescente por informatização no setor da saúde, promovendo maior eficiência, segurança e comodidade para pacientes e profissionais</w:t>
       </w:r>
       <w:r>
         <w:t>.</w:t>
@@ -1732,7 +1728,31 @@
         <w:rPr>
           <w:b w:val="0"/>
         </w:rPr>
-        <w:t>Desenvolver uma aplicação web para gerenciamento de clínicas médicas que permita o cadastro de pacientes, agendamento de consultas, registro de prontuários médicos, geração de relatórios e gestão de dados clínicos e administrativos, garantindo segurança da informação, acessibilidade e usabilidade.</w:t>
+        <w:t xml:space="preserve">Desenvolver uma aplicação web para gerenciamento de </w:t>
+      </w:r>
+      <w:r>
+        <w:rPr>
+          <w:b w:val="0"/>
+        </w:rPr>
+        <w:t>uma clínica médica</w:t>
+      </w:r>
+      <w:r>
+        <w:rPr>
+          <w:b w:val="0"/>
+        </w:rPr>
+        <w:t xml:space="preserve"> que permita o cadastro de pacientes, agendamento de consultas, geração de relatórios e gestão de </w:t>
+      </w:r>
+      <w:r>
+        <w:rPr>
+          <w:b w:val="0"/>
+        </w:rPr>
+        <w:t>dados clínicos</w:t>
+      </w:r>
+      <w:r>
+        <w:rPr>
+          <w:b w:val="0"/>
+        </w:rPr>
+        <w:t>, garantindo segurança da informação, acessibilidade e usabilidade.</w:t>
       </w:r>
       <w:bookmarkEnd w:id="7"/>
       <w:bookmarkEnd w:id="8"/>
@@ -1853,35 +1873,7 @@
         <w:rPr>
           <w:b w:val="0"/>
         </w:rPr>
-        <w:t>- MVC: Model-</w:t>
-      </w:r>
-      <w:proofErr w:type="spellStart"/>
-      <w:r>
-        <w:rPr>
-          <w:b w:val="0"/>
-        </w:rPr>
-        <w:t>View</w:t>
-      </w:r>
-      <w:proofErr w:type="spellEnd"/>
-      <w:r>
-        <w:rPr>
-          <w:b w:val="0"/>
-        </w:rPr>
-        <w:t>-</w:t>
-      </w:r>
-      <w:proofErr w:type="spellStart"/>
-      <w:r>
-        <w:rPr>
-          <w:b w:val="0"/>
-        </w:rPr>
-        <w:t>Controller</w:t>
-      </w:r>
-      <w:proofErr w:type="spellEnd"/>
-      <w:r>
-        <w:rPr>
-          <w:b w:val="0"/>
-        </w:rPr>
-        <w:t>, padrão de arquitetura de software.</w:t>
+        <w:t>- MVC: Model-View-Controller, padrão de arquitetura de software.</w:t>
       </w:r>
       <w:bookmarkEnd w:id="16"/>
       <w:bookmarkEnd w:id="17"/>
@@ -1966,10 +1958,18 @@
         <w:rPr>
           <w:b w:val="0"/>
         </w:rPr>
-        <w:t>REZENDE, Denis Alcides. Tecnologia da informação: integrada à inteligência empresarial. São Paulo: Atlas, 2002.</w:t>
+        <w:t>REZENDE, Denis Alcides. Tecnologia da informação: integrada à inteligência empresarial. São Paulo: Atlas, 2002</w:t>
       </w:r>
       <w:bookmarkEnd w:id="21"/>
       <w:bookmarkEnd w:id="22"/>
+      <w:r>
+        <w:rPr>
+          <w:b w:val="0"/>
+        </w:rPr>
+        <w:t>.</w:t>
+      </w:r>
+      <w:bookmarkStart w:id="23" w:name="_GoBack"/>
+      <w:bookmarkEnd w:id="23"/>
     </w:p>
     <w:p>
       <w:pPr>
@@ -1984,8 +1984,8 @@
           <w:b w:val="0"/>
         </w:rPr>
       </w:pPr>
-      <w:bookmarkStart w:id="23" w:name="_Toc198320738"/>
-      <w:bookmarkStart w:id="24" w:name="_Toc198320906"/>
+      <w:bookmarkStart w:id="24" w:name="_Toc198320738"/>
+      <w:bookmarkStart w:id="25" w:name="_Toc198320906"/>
       <w:r>
         <w:rPr>
           <w:b w:val="0"/>
@@ -1998,8 +1998,8 @@
         </w:rPr>
         <w:t>CASTELLS, Manuel. Fim de milênio: economia, sociedade e cultura. São Paulo: Paz e Terra, 1999.</w:t>
       </w:r>
-      <w:bookmarkEnd w:id="23"/>
       <w:bookmarkEnd w:id="24"/>
+      <w:bookmarkEnd w:id="25"/>
     </w:p>
     <w:p>
       <w:pPr>
@@ -2014,8 +2014,8 @@
           <w:b w:val="0"/>
         </w:rPr>
       </w:pPr>
-      <w:bookmarkStart w:id="25" w:name="_Toc198320739"/>
-      <w:bookmarkStart w:id="26" w:name="_Toc198320907"/>
+      <w:bookmarkStart w:id="26" w:name="_Toc198320739"/>
+      <w:bookmarkStart w:id="27" w:name="_Toc198320907"/>
       <w:r>
         <w:rPr>
           <w:b w:val="0"/>
@@ -2028,8 +2028,8 @@
         </w:rPr>
         <w:t>Outras fontes conforme bibliografia do projeto acadêmico original.</w:t>
       </w:r>
-      <w:bookmarkEnd w:id="25"/>
       <w:bookmarkEnd w:id="26"/>
+      <w:bookmarkEnd w:id="27"/>
     </w:p>
     <w:p/>
     <w:p/>
@@ -2043,8 +2043,8 @@
           <w:lang w:eastAsia="pt-BR"/>
         </w:rPr>
       </w:pPr>
-      <w:bookmarkStart w:id="27" w:name="_Toc198320740"/>
-      <w:bookmarkStart w:id="28" w:name="_Toc198320908"/>
+      <w:bookmarkStart w:id="28" w:name="_Toc198320740"/>
+      <w:bookmarkStart w:id="29" w:name="_Toc198320908"/>
       <w:r>
         <w:rPr>
           <w:rFonts w:eastAsiaTheme="minorEastAsia"/>
@@ -2054,8 +2054,8 @@
         <w:lastRenderedPageBreak/>
         <w:t>PROBLEMA</w:t>
       </w:r>
-      <w:bookmarkEnd w:id="27"/>
       <w:bookmarkEnd w:id="28"/>
+      <w:bookmarkEnd w:id="29"/>
     </w:p>
     <w:tbl>
       <w:tblPr>
@@ -2371,14 +2371,14 @@
           <w:lang w:val="pt-PT"/>
         </w:rPr>
       </w:pPr>
-      <w:bookmarkStart w:id="29" w:name="_Toc198320741"/>
-      <w:bookmarkStart w:id="30" w:name="_Toc198320909"/>
+      <w:bookmarkStart w:id="30" w:name="_Toc198320741"/>
+      <w:bookmarkStart w:id="31" w:name="_Toc198320909"/>
       <w:r>
         <w:lastRenderedPageBreak/>
         <w:t>USUÁRIOS</w:t>
       </w:r>
-      <w:bookmarkEnd w:id="29"/>
       <w:bookmarkEnd w:id="30"/>
+      <w:bookmarkEnd w:id="31"/>
       <w:r>
         <w:br/>
       </w:r>
@@ -3022,13 +3022,13 @@
         <w:spacing w:before="0" w:after="0" w:line="360" w:lineRule="auto"/>
         <w:jc w:val="left"/>
       </w:pPr>
-      <w:bookmarkStart w:id="31" w:name="_Toc198320742"/>
-      <w:bookmarkStart w:id="32" w:name="_Toc198320910"/>
+      <w:bookmarkStart w:id="32" w:name="_Toc198320742"/>
+      <w:bookmarkStart w:id="33" w:name="_Toc198320910"/>
       <w:r>
         <w:t>RESTRIÇÕES IMPOSTAS</w:t>
       </w:r>
-      <w:bookmarkEnd w:id="31"/>
       <w:bookmarkEnd w:id="32"/>
+      <w:bookmarkEnd w:id="33"/>
     </w:p>
     <w:p>
       <w:pPr>
@@ -3107,13 +3107,13 @@
           <w:lang w:val="pt-PT"/>
         </w:rPr>
       </w:pPr>
-      <w:bookmarkStart w:id="33" w:name="_Toc198320743"/>
-      <w:bookmarkStart w:id="34" w:name="_Toc198320911"/>
+      <w:bookmarkStart w:id="34" w:name="_Toc198320743"/>
+      <w:bookmarkStart w:id="35" w:name="_Toc198320911"/>
       <w:r>
         <w:t>RISCOS</w:t>
       </w:r>
-      <w:bookmarkEnd w:id="33"/>
       <w:bookmarkEnd w:id="34"/>
+      <w:bookmarkEnd w:id="35"/>
     </w:p>
     <w:p>
       <w:pPr>
@@ -3169,13 +3169,13 @@
         <w:pStyle w:val="Ttulo1"/>
         <w:spacing w:before="0" w:after="0" w:line="360" w:lineRule="auto"/>
       </w:pPr>
-      <w:bookmarkStart w:id="35" w:name="_Toc198320744"/>
-      <w:bookmarkStart w:id="36" w:name="_Toc198320912"/>
+      <w:bookmarkStart w:id="36" w:name="_Toc198320744"/>
+      <w:bookmarkStart w:id="37" w:name="_Toc198320912"/>
       <w:r>
         <w:t>REQUISITOS DE DOCUMENTAÇÃO</w:t>
       </w:r>
-      <w:bookmarkEnd w:id="35"/>
       <w:bookmarkEnd w:id="36"/>
+      <w:bookmarkEnd w:id="37"/>
     </w:p>
     <w:p>
       <w:pPr>
@@ -3252,7 +3252,7 @@
 </file>
 
 <file path=word/endnotes.xml><?xml version="1.0" encoding="utf-8"?>
-<w:endnotes xmlns:wpc="http://schemas.microsoft.com/office/word/2010/wordprocessingCanvas" xmlns:cx="http://schemas.microsoft.com/office/drawing/2014/chartex" xmlns:cx1="http://schemas.microsoft.com/office/drawing/2015/9/8/chartex" xmlns:cx2="http://schemas.microsoft.com/office/drawing/2015/10/21/chartex" xmlns:cx3="http://schemas.microsoft.com/office/drawing/2016/5/9/chartex" xmlns:cx4="http://schemas.microsoft.com/office/drawing/2016/5/10/chartex" xmlns:cx5="http://schemas.microsoft.com/office/drawing/2016/5/11/chartex" xmlns:cx6="http://schemas.microsoft.com/office/drawing/2016/5/12/chartex" xmlns:cx7="http://schemas.microsoft.com/office/drawing/2016/5/13/chartex" xmlns:cx8="http://schemas.microsoft.com/office/drawing/2016/5/14/chartex" xmlns:mc="http://schemas.openxmlformats.org/markup-compatibility/2006" xmlns:aink="http://schemas.microsoft.com/office/drawing/2016/ink" xmlns:am3d="http://schemas.microsoft.com/office/drawing/2017/model3d" xmlns:o="urn:schemas-microsoft-com:office:office" xmlns:oel="http://schemas.microsoft.com/office/2019/extlst" xmlns:r="http://schemas.openxmlformats.org/officeDocument/2006/relationships" xmlns:m="http://schemas.openxmlformats.org/officeDocument/2006/math" xmlns:v="urn:schemas-microsoft-com:vml" xmlns:wp14="http://schemas.microsoft.com/office/word/2010/wordprocessingDrawing" xmlns:wp="http://schemas.openxmlformats.org/drawingml/2006/wordprocessingDrawing" xmlns:w10="urn:schemas-microsoft-com:office:word" xmlns:w="http://schemas.openxmlformats.org/wordprocessingml/2006/main" xmlns:w14="http://schemas.microsoft.com/office/word/2010/wordml" xmlns:w15="http://schemas.microsoft.com/office/word/2012/wordml" xmlns:w16cex="http://schemas.microsoft.com/office/word/2018/wordml/cex" xmlns:w16cid="http://schemas.microsoft.com/office/word/2016/wordml/cid" xmlns:w16="http://schemas.microsoft.com/office/word/2018/wordml" xmlns:w16du="http://schemas.microsoft.com/office/word/2023/wordml/word16du" xmlns:w16sdtdh="http://schemas.microsoft.com/office/word/2020/wordml/sdtdatahash" xmlns:w16sdtfl="http://schemas.microsoft.com/office/word/2024/wordml/sdtformatlock" xmlns:w16se="http://schemas.microsoft.com/office/word/2015/wordml/symex" xmlns:wpg="http://schemas.microsoft.com/office/word/2010/wordprocessingGroup" xmlns:wpi="http://schemas.microsoft.com/office/word/2010/wordprocessingInk" xmlns:wne="http://schemas.microsoft.com/office/word/2006/wordml" xmlns:wps="http://schemas.microsoft.com/office/word/2010/wordprocessingShape" mc:Ignorable="w14 w15 w16se w16cid w16 w16cex w16sdtdh w16sdtfl w16du wp14">
+<w:endnotes xmlns:wpc="http://schemas.microsoft.com/office/word/2010/wordprocessingCanvas" xmlns:cx="http://schemas.microsoft.com/office/drawing/2014/chartex" xmlns:mc="http://schemas.openxmlformats.org/markup-compatibility/2006" xmlns:o="urn:schemas-microsoft-com:office:office" xmlns:r="http://schemas.openxmlformats.org/officeDocument/2006/relationships" xmlns:m="http://schemas.openxmlformats.org/officeDocument/2006/math" xmlns:v="urn:schemas-microsoft-com:vml" xmlns:wp14="http://schemas.microsoft.com/office/word/2010/wordprocessingDrawing" xmlns:wp="http://schemas.openxmlformats.org/drawingml/2006/wordprocessingDrawing" xmlns:w10="urn:schemas-microsoft-com:office:word" xmlns:w="http://schemas.openxmlformats.org/wordprocessingml/2006/main" xmlns:w14="http://schemas.microsoft.com/office/word/2010/wordml" xmlns:w15="http://schemas.microsoft.com/office/word/2012/wordml" xmlns:w16se="http://schemas.microsoft.com/office/word/2015/wordml/symex" xmlns:wpg="http://schemas.microsoft.com/office/word/2010/wordprocessingGroup" xmlns:wpi="http://schemas.microsoft.com/office/word/2010/wordprocessingInk" xmlns:wne="http://schemas.microsoft.com/office/word/2006/wordml" xmlns:wps="http://schemas.microsoft.com/office/word/2010/wordprocessingShape" mc:Ignorable="w14 w15 w16se wp14">
   <w:endnote w:type="separator" w:id="-1">
     <w:p>
       <w:pPr>
@@ -3277,7 +3277,7 @@
 </file>
 
 <file path=word/footer1.xml><?xml version="1.0" encoding="utf-8"?>
-<w:ftr xmlns:wpc="http://schemas.microsoft.com/office/word/2010/wordprocessingCanvas" xmlns:cx="http://schemas.microsoft.com/office/drawing/2014/chartex" xmlns:cx1="http://schemas.microsoft.com/office/drawing/2015/9/8/chartex" xmlns:cx2="http://schemas.microsoft.com/office/drawing/2015/10/21/chartex" xmlns:cx3="http://schemas.microsoft.com/office/drawing/2016/5/9/chartex" xmlns:cx4="http://schemas.microsoft.com/office/drawing/2016/5/10/chartex" xmlns:cx5="http://schemas.microsoft.com/office/drawing/2016/5/11/chartex" xmlns:cx6="http://schemas.microsoft.com/office/drawing/2016/5/12/chartex" xmlns:cx7="http://schemas.microsoft.com/office/drawing/2016/5/13/chartex" xmlns:cx8="http://schemas.microsoft.com/office/drawing/2016/5/14/chartex" xmlns:mc="http://schemas.openxmlformats.org/markup-compatibility/2006" xmlns:aink="http://schemas.microsoft.com/office/drawing/2016/ink" xmlns:am3d="http://schemas.microsoft.com/office/drawing/2017/model3d" xmlns:o="urn:schemas-microsoft-com:office:office" xmlns:oel="http://schemas.microsoft.com/office/2019/extlst" xmlns:r="http://schemas.openxmlformats.org/officeDocument/2006/relationships" xmlns:m="http://schemas.openxmlformats.org/officeDocument/2006/math" xmlns:v="urn:schemas-microsoft-com:vml" xmlns:wp14="http://schemas.microsoft.com/office/word/2010/wordprocessingDrawing" xmlns:wp="http://schemas.openxmlformats.org/drawingml/2006/wordprocessingDrawing" xmlns:w10="urn:schemas-microsoft-com:office:word" xmlns:w="http://schemas.openxmlformats.org/wordprocessingml/2006/main" xmlns:w14="http://schemas.microsoft.com/office/word/2010/wordml" xmlns:w15="http://schemas.microsoft.com/office/word/2012/wordml" xmlns:w16cex="http://schemas.microsoft.com/office/word/2018/wordml/cex" xmlns:w16cid="http://schemas.microsoft.com/office/word/2016/wordml/cid" xmlns:w16="http://schemas.microsoft.com/office/word/2018/wordml" xmlns:w16du="http://schemas.microsoft.com/office/word/2023/wordml/word16du" xmlns:w16sdtdh="http://schemas.microsoft.com/office/word/2020/wordml/sdtdatahash" xmlns:w16sdtfl="http://schemas.microsoft.com/office/word/2024/wordml/sdtformatlock" xmlns:w16se="http://schemas.microsoft.com/office/word/2015/wordml/symex" xmlns:wpg="http://schemas.microsoft.com/office/word/2010/wordprocessingGroup" xmlns:wpi="http://schemas.microsoft.com/office/word/2010/wordprocessingInk" xmlns:wne="http://schemas.microsoft.com/office/word/2006/wordml" xmlns:wps="http://schemas.microsoft.com/office/word/2010/wordprocessingShape" mc:Ignorable="w14 w15 w16se w16cid w16 w16cex w16sdtdh w16sdtfl w16du wp14">
+<w:ftr xmlns:wpc="http://schemas.microsoft.com/office/word/2010/wordprocessingCanvas" xmlns:cx="http://schemas.microsoft.com/office/drawing/2014/chartex" xmlns:mc="http://schemas.openxmlformats.org/markup-compatibility/2006" xmlns:o="urn:schemas-microsoft-com:office:office" xmlns:r="http://schemas.openxmlformats.org/officeDocument/2006/relationships" xmlns:m="http://schemas.openxmlformats.org/officeDocument/2006/math" xmlns:v="urn:schemas-microsoft-com:vml" xmlns:wp14="http://schemas.microsoft.com/office/word/2010/wordprocessingDrawing" xmlns:wp="http://schemas.openxmlformats.org/drawingml/2006/wordprocessingDrawing" xmlns:w10="urn:schemas-microsoft-com:office:word" xmlns:w="http://schemas.openxmlformats.org/wordprocessingml/2006/main" xmlns:w14="http://schemas.microsoft.com/office/word/2010/wordml" xmlns:w15="http://schemas.microsoft.com/office/word/2012/wordml" xmlns:w16se="http://schemas.microsoft.com/office/word/2015/wordml/symex" xmlns:wpg="http://schemas.microsoft.com/office/word/2010/wordprocessingGroup" xmlns:wpi="http://schemas.microsoft.com/office/word/2010/wordprocessingInk" xmlns:wne="http://schemas.microsoft.com/office/word/2006/wordml" xmlns:wps="http://schemas.microsoft.com/office/word/2010/wordprocessingShape" mc:Ignorable="w14 w15 w16se wp14">
   <w:sdt>
     <w:sdtPr>
       <w:rPr>
@@ -3420,7 +3420,7 @@
                 <w:sz w:val="20"/>
                 <w:szCs w:val="20"/>
               </w:rPr>
-              <w:t>1</w:t>
+              <w:t>4</w:t>
             </w:r>
             <w:r>
               <w:rPr>
@@ -3539,7 +3539,7 @@
 </file>
 
 <file path=word/footnotes.xml><?xml version="1.0" encoding="utf-8"?>
-<w:footnotes xmlns:wpc="http://schemas.microsoft.com/office/word/2010/wordprocessingCanvas" xmlns:cx="http://schemas.microsoft.com/office/drawing/2014/chartex" xmlns:cx1="http://schemas.microsoft.com/office/drawing/2015/9/8/chartex" xmlns:cx2="http://schemas.microsoft.com/office/drawing/2015/10/21/chartex" xmlns:cx3="http://schemas.microsoft.com/office/drawing/2016/5/9/chartex" xmlns:cx4="http://schemas.microsoft.com/office/drawing/2016/5/10/chartex" xmlns:cx5="http://schemas.microsoft.com/office/drawing/2016/5/11/chartex" xmlns:cx6="http://schemas.microsoft.com/office/drawing/2016/5/12/chartex" xmlns:cx7="http://schemas.microsoft.com/office/drawing/2016/5/13/chartex" xmlns:cx8="http://schemas.microsoft.com/office/drawing/2016/5/14/chartex" xmlns:mc="http://schemas.openxmlformats.org/markup-compatibility/2006" xmlns:aink="http://schemas.microsoft.com/office/drawing/2016/ink" xmlns:am3d="http://schemas.microsoft.com/office/drawing/2017/model3d" xmlns:o="urn:schemas-microsoft-com:office:office" xmlns:oel="http://schemas.microsoft.com/office/2019/extlst" xmlns:r="http://schemas.openxmlformats.org/officeDocument/2006/relationships" xmlns:m="http://schemas.openxmlformats.org/officeDocument/2006/math" xmlns:v="urn:schemas-microsoft-com:vml" xmlns:wp14="http://schemas.microsoft.com/office/word/2010/wordprocessingDrawing" xmlns:wp="http://schemas.openxmlformats.org/drawingml/2006/wordprocessingDrawing" xmlns:w10="urn:schemas-microsoft-com:office:word" xmlns:w="http://schemas.openxmlformats.org/wordprocessingml/2006/main" xmlns:w14="http://schemas.microsoft.com/office/word/2010/wordml" xmlns:w15="http://schemas.microsoft.com/office/word/2012/wordml" xmlns:w16cex="http://schemas.microsoft.com/office/word/2018/wordml/cex" xmlns:w16cid="http://schemas.microsoft.com/office/word/2016/wordml/cid" xmlns:w16="http://schemas.microsoft.com/office/word/2018/wordml" xmlns:w16du="http://schemas.microsoft.com/office/word/2023/wordml/word16du" xmlns:w16sdtdh="http://schemas.microsoft.com/office/word/2020/wordml/sdtdatahash" xmlns:w16sdtfl="http://schemas.microsoft.com/office/word/2024/wordml/sdtformatlock" xmlns:w16se="http://schemas.microsoft.com/office/word/2015/wordml/symex" xmlns:wpg="http://schemas.microsoft.com/office/word/2010/wordprocessingGroup" xmlns:wpi="http://schemas.microsoft.com/office/word/2010/wordprocessingInk" xmlns:wne="http://schemas.microsoft.com/office/word/2006/wordml" xmlns:wps="http://schemas.microsoft.com/office/word/2010/wordprocessingShape" mc:Ignorable="w14 w15 w16se w16cid w16 w16cex w16sdtdh w16sdtfl w16du wp14">
+<w:footnotes xmlns:wpc="http://schemas.microsoft.com/office/word/2010/wordprocessingCanvas" xmlns:cx="http://schemas.microsoft.com/office/drawing/2014/chartex" xmlns:mc="http://schemas.openxmlformats.org/markup-compatibility/2006" xmlns:o="urn:schemas-microsoft-com:office:office" xmlns:r="http://schemas.openxmlformats.org/officeDocument/2006/relationships" xmlns:m="http://schemas.openxmlformats.org/officeDocument/2006/math" xmlns:v="urn:schemas-microsoft-com:vml" xmlns:wp14="http://schemas.microsoft.com/office/word/2010/wordprocessingDrawing" xmlns:wp="http://schemas.openxmlformats.org/drawingml/2006/wordprocessingDrawing" xmlns:w10="urn:schemas-microsoft-com:office:word" xmlns:w="http://schemas.openxmlformats.org/wordprocessingml/2006/main" xmlns:w14="http://schemas.microsoft.com/office/word/2010/wordml" xmlns:w15="http://schemas.microsoft.com/office/word/2012/wordml" xmlns:w16se="http://schemas.microsoft.com/office/word/2015/wordml/symex" xmlns:wpg="http://schemas.microsoft.com/office/word/2010/wordprocessingGroup" xmlns:wpi="http://schemas.microsoft.com/office/word/2010/wordprocessingInk" xmlns:wne="http://schemas.microsoft.com/office/word/2006/wordml" xmlns:wps="http://schemas.microsoft.com/office/word/2010/wordprocessingShape" mc:Ignorable="w14 w15 w16se wp14">
   <w:footnote w:type="separator" w:id="-1">
     <w:p>
       <w:pPr>
@@ -3564,7 +3564,7 @@
 </file>
 
 <file path=word/header1.xml><?xml version="1.0" encoding="utf-8"?>
-<w:hdr xmlns:wpc="http://schemas.microsoft.com/office/word/2010/wordprocessingCanvas" xmlns:cx="http://schemas.microsoft.com/office/drawing/2014/chartex" xmlns:cx1="http://schemas.microsoft.com/office/drawing/2015/9/8/chartex" xmlns:cx2="http://schemas.microsoft.com/office/drawing/2015/10/21/chartex" xmlns:cx3="http://schemas.microsoft.com/office/drawing/2016/5/9/chartex" xmlns:cx4="http://schemas.microsoft.com/office/drawing/2016/5/10/chartex" xmlns:cx5="http://schemas.microsoft.com/office/drawing/2016/5/11/chartex" xmlns:cx6="http://schemas.microsoft.com/office/drawing/2016/5/12/chartex" xmlns:cx7="http://schemas.microsoft.com/office/drawing/2016/5/13/chartex" xmlns:cx8="http://schemas.microsoft.com/office/drawing/2016/5/14/chartex" xmlns:mc="http://schemas.openxmlformats.org/markup-compatibility/2006" xmlns:aink="http://schemas.microsoft.com/office/drawing/2016/ink" xmlns:am3d="http://schemas.microsoft.com/office/drawing/2017/model3d" xmlns:o="urn:schemas-microsoft-com:office:office" xmlns:oel="http://schemas.microsoft.com/office/2019/extlst" xmlns:r="http://schemas.openxmlformats.org/officeDocument/2006/relationships" xmlns:m="http://schemas.openxmlformats.org/officeDocument/2006/math" xmlns:v="urn:schemas-microsoft-com:vml" xmlns:wp14="http://schemas.microsoft.com/office/word/2010/wordprocessingDrawing" xmlns:wp="http://schemas.openxmlformats.org/drawingml/2006/wordprocessingDrawing" xmlns:w10="urn:schemas-microsoft-com:office:word" xmlns:w="http://schemas.openxmlformats.org/wordprocessingml/2006/main" xmlns:w14="http://schemas.microsoft.com/office/word/2010/wordml" xmlns:w15="http://schemas.microsoft.com/office/word/2012/wordml" xmlns:w16cex="http://schemas.microsoft.com/office/word/2018/wordml/cex" xmlns:w16cid="http://schemas.microsoft.com/office/word/2016/wordml/cid" xmlns:w16="http://schemas.microsoft.com/office/word/2018/wordml" xmlns:w16du="http://schemas.microsoft.com/office/word/2023/wordml/word16du" xmlns:w16sdtdh="http://schemas.microsoft.com/office/word/2020/wordml/sdtdatahash" xmlns:w16sdtfl="http://schemas.microsoft.com/office/word/2024/wordml/sdtformatlock" xmlns:w16se="http://schemas.microsoft.com/office/word/2015/wordml/symex" xmlns:wpg="http://schemas.microsoft.com/office/word/2010/wordprocessingGroup" xmlns:wpi="http://schemas.microsoft.com/office/word/2010/wordprocessingInk" xmlns:wne="http://schemas.microsoft.com/office/word/2006/wordml" xmlns:wps="http://schemas.microsoft.com/office/word/2010/wordprocessingShape" mc:Ignorable="w14 w15 w16se w16cid w16 w16cex w16sdtdh w16sdtfl w16du wp14">
+<w:hdr xmlns:wpc="http://schemas.microsoft.com/office/word/2010/wordprocessingCanvas" xmlns:cx="http://schemas.microsoft.com/office/drawing/2014/chartex" xmlns:mc="http://schemas.openxmlformats.org/markup-compatibility/2006" xmlns:o="urn:schemas-microsoft-com:office:office" xmlns:r="http://schemas.openxmlformats.org/officeDocument/2006/relationships" xmlns:m="http://schemas.openxmlformats.org/officeDocument/2006/math" xmlns:v="urn:schemas-microsoft-com:vml" xmlns:wp14="http://schemas.microsoft.com/office/word/2010/wordprocessingDrawing" xmlns:wp="http://schemas.openxmlformats.org/drawingml/2006/wordprocessingDrawing" xmlns:w10="urn:schemas-microsoft-com:office:word" xmlns:w="http://schemas.openxmlformats.org/wordprocessingml/2006/main" xmlns:w14="http://schemas.microsoft.com/office/word/2010/wordml" xmlns:w15="http://schemas.microsoft.com/office/word/2012/wordml" xmlns:w16se="http://schemas.microsoft.com/office/word/2015/wordml/symex" xmlns:wpg="http://schemas.microsoft.com/office/word/2010/wordprocessingGroup" xmlns:wpi="http://schemas.microsoft.com/office/word/2010/wordprocessingInk" xmlns:wne="http://schemas.microsoft.com/office/word/2006/wordml" xmlns:wps="http://schemas.microsoft.com/office/word/2010/wordprocessingShape" mc:Ignorable="w14 w15 w16se wp14">
   <w:p>
     <w:pPr>
       <w:pStyle w:val="Cabealho"/>
@@ -3580,7 +3580,7 @@
 </file>
 
 <file path=word/numbering.xml><?xml version="1.0" encoding="utf-8"?>
-<w:numbering xmlns:wpc="http://schemas.microsoft.com/office/word/2010/wordprocessingCanvas" xmlns:cx="http://schemas.microsoft.com/office/drawing/2014/chartex" xmlns:cx1="http://schemas.microsoft.com/office/drawing/2015/9/8/chartex" xmlns:cx2="http://schemas.microsoft.com/office/drawing/2015/10/21/chartex" xmlns:cx3="http://schemas.microsoft.com/office/drawing/2016/5/9/chartex" xmlns:cx4="http://schemas.microsoft.com/office/drawing/2016/5/10/chartex" xmlns:cx5="http://schemas.microsoft.com/office/drawing/2016/5/11/chartex" xmlns:cx6="http://schemas.microsoft.com/office/drawing/2016/5/12/chartex" xmlns:cx7="http://schemas.microsoft.com/office/drawing/2016/5/13/chartex" xmlns:cx8="http://schemas.microsoft.com/office/drawing/2016/5/14/chartex" xmlns:mc="http://schemas.openxmlformats.org/markup-compatibility/2006" xmlns:aink="http://schemas.microsoft.com/office/drawing/2016/ink" xmlns:am3d="http://schemas.microsoft.com/office/drawing/2017/model3d" xmlns:o="urn:schemas-microsoft-com:office:office" xmlns:oel="http://schemas.microsoft.com/office/2019/extlst" xmlns:r="http://schemas.openxmlformats.org/officeDocument/2006/relationships" xmlns:m="http://schemas.openxmlformats.org/officeDocument/2006/math" xmlns:v="urn:schemas-microsoft-com:vml" xmlns:wp14="http://schemas.microsoft.com/office/word/2010/wordprocessingDrawing" xmlns:wp="http://schemas.openxmlformats.org/drawingml/2006/wordprocessingDrawing" xmlns:w10="urn:schemas-microsoft-com:office:word" xmlns:w="http://schemas.openxmlformats.org/wordprocessingml/2006/main" xmlns:w14="http://schemas.microsoft.com/office/word/2010/wordml" xmlns:w15="http://schemas.microsoft.com/office/word/2012/wordml" xmlns:w16cex="http://schemas.microsoft.com/office/word/2018/wordml/cex" xmlns:w16cid="http://schemas.microsoft.com/office/word/2016/wordml/cid" xmlns:w16="http://schemas.microsoft.com/office/word/2018/wordml" xmlns:w16du="http://schemas.microsoft.com/office/word/2023/wordml/word16du" xmlns:w16sdtdh="http://schemas.microsoft.com/office/word/2020/wordml/sdtdatahash" xmlns:w16sdtfl="http://schemas.microsoft.com/office/word/2024/wordml/sdtformatlock" xmlns:w16se="http://schemas.microsoft.com/office/word/2015/wordml/symex" xmlns:wpg="http://schemas.microsoft.com/office/word/2010/wordprocessingGroup" xmlns:wpi="http://schemas.microsoft.com/office/word/2010/wordprocessingInk" xmlns:wne="http://schemas.microsoft.com/office/word/2006/wordml" xmlns:wps="http://schemas.microsoft.com/office/word/2010/wordprocessingShape" mc:Ignorable="w14 w15 w16se w16cid w16 w16cex w16sdtdh w16sdtfl w16du wp14">
+<w:numbering xmlns:wpc="http://schemas.microsoft.com/office/word/2010/wordprocessingCanvas" xmlns:cx="http://schemas.microsoft.com/office/drawing/2014/chartex" xmlns:mc="http://schemas.openxmlformats.org/markup-compatibility/2006" xmlns:o="urn:schemas-microsoft-com:office:office" xmlns:r="http://schemas.openxmlformats.org/officeDocument/2006/relationships" xmlns:m="http://schemas.openxmlformats.org/officeDocument/2006/math" xmlns:v="urn:schemas-microsoft-com:vml" xmlns:wp14="http://schemas.microsoft.com/office/word/2010/wordprocessingDrawing" xmlns:wp="http://schemas.openxmlformats.org/drawingml/2006/wordprocessingDrawing" xmlns:w10="urn:schemas-microsoft-com:office:word" xmlns:w="http://schemas.openxmlformats.org/wordprocessingml/2006/main" xmlns:w14="http://schemas.microsoft.com/office/word/2010/wordml" xmlns:w15="http://schemas.microsoft.com/office/word/2012/wordml" xmlns:w16se="http://schemas.microsoft.com/office/word/2015/wordml/symex" xmlns:wpg="http://schemas.microsoft.com/office/word/2010/wordprocessingGroup" xmlns:wpi="http://schemas.microsoft.com/office/word/2010/wordprocessingInk" xmlns:wne="http://schemas.microsoft.com/office/word/2006/wordml" xmlns:wps="http://schemas.microsoft.com/office/word/2010/wordprocessingShape" mc:Ignorable="w14 w15 w16se wp14">
   <w:abstractNum w:abstractNumId="0" w15:restartNumberingAfterBreak="0">
     <w:nsid w:val="73F37BFE"/>
     <w:multiLevelType w:val="hybridMultilevel"/>
@@ -3734,7 +3734,7 @@
       <w:lvlText w:val="%1."/>
       <w:lvlJc w:val="left"/>
       <w:pPr>
-        <w:ind w:left="574" w:hanging="432"/>
+        <w:ind w:left="432" w:hanging="432"/>
       </w:pPr>
       <w:rPr>
         <w:rFonts w:hint="default"/>
@@ -3859,17 +3859,17 @@
       </w:rPr>
     </w:lvl>
   </w:abstractNum>
-  <w:num w:numId="1" w16cid:durableId="1463308125">
+  <w:num w:numId="1">
     <w:abstractNumId w:val="1"/>
   </w:num>
-  <w:num w:numId="2" w16cid:durableId="943196432">
+  <w:num w:numId="2">
     <w:abstractNumId w:val="0"/>
   </w:num>
 </w:numbering>
 </file>
 
 <file path=word/styles.xml><?xml version="1.0" encoding="utf-8"?>
-<w:styles xmlns:mc="http://schemas.openxmlformats.org/markup-compatibility/2006" xmlns:r="http://schemas.openxmlformats.org/officeDocument/2006/relationships" xmlns:w="http://schemas.openxmlformats.org/wordprocessingml/2006/main" xmlns:w14="http://schemas.microsoft.com/office/word/2010/wordml" xmlns:w15="http://schemas.microsoft.com/office/word/2012/wordml" xmlns:w16cex="http://schemas.microsoft.com/office/word/2018/wordml/cex" xmlns:w16cid="http://schemas.microsoft.com/office/word/2016/wordml/cid" xmlns:w16="http://schemas.microsoft.com/office/word/2018/wordml" xmlns:w16du="http://schemas.microsoft.com/office/word/2023/wordml/word16du" xmlns:w16sdtdh="http://schemas.microsoft.com/office/word/2020/wordml/sdtdatahash" xmlns:w16sdtfl="http://schemas.microsoft.com/office/word/2024/wordml/sdtformatlock" xmlns:w16se="http://schemas.microsoft.com/office/word/2015/wordml/symex" mc:Ignorable="w14 w15 w16se w16cid w16 w16cex w16sdtdh w16sdtfl w16du">
+<w:styles xmlns:mc="http://schemas.openxmlformats.org/markup-compatibility/2006" xmlns:r="http://schemas.openxmlformats.org/officeDocument/2006/relationships" xmlns:w="http://schemas.openxmlformats.org/wordprocessingml/2006/main" xmlns:w14="http://schemas.microsoft.com/office/word/2010/wordml" xmlns:w15="http://schemas.microsoft.com/office/word/2012/wordml" xmlns:w16se="http://schemas.microsoft.com/office/word/2015/wordml/symex" mc:Ignorable="w14 w15 w16se">
   <w:docDefaults>
     <w:rPrDefault>
       <w:rPr>
@@ -3885,7 +3885,7 @@
       </w:pPr>
     </w:pPrDefault>
   </w:docDefaults>
-  <w:latentStyles w:defLockedState="0" w:defUIPriority="99" w:defSemiHidden="0" w:defUnhideWhenUsed="0" w:defQFormat="0" w:count="376">
+  <w:latentStyles w:defLockedState="0" w:defUIPriority="99" w:defSemiHidden="0" w:defUnhideWhenUsed="0" w:defQFormat="0" w:count="371">
     <w:lsdException w:name="Normal" w:uiPriority="0" w:qFormat="1"/>
     <w:lsdException w:name="heading 1" w:uiPriority="0" w:qFormat="1"/>
     <w:lsdException w:name="heading 2" w:semiHidden="1" w:uiPriority="0" w:unhideWhenUsed="1" w:qFormat="1"/>
@@ -4257,11 +4257,6 @@
     <w:lsdException w:name="List Table 5 Dark Accent 6" w:uiPriority="50"/>
     <w:lsdException w:name="List Table 6 Colorful Accent 6" w:uiPriority="51"/>
     <w:lsdException w:name="List Table 7 Colorful Accent 6" w:uiPriority="52"/>
-    <w:lsdException w:name="Mention" w:semiHidden="1" w:unhideWhenUsed="1"/>
-    <w:lsdException w:name="Smart Hyperlink" w:semiHidden="1" w:unhideWhenUsed="1"/>
-    <w:lsdException w:name="Hashtag" w:semiHidden="1" w:unhideWhenUsed="1"/>
-    <w:lsdException w:name="Unresolved Mention" w:semiHidden="1" w:unhideWhenUsed="1"/>
-    <w:lsdException w:name="Smart Link" w:semiHidden="1" w:unhideWhenUsed="1"/>
   </w:latentStyles>
   <w:style w:type="paragraph" w:default="1" w:styleId="Normal">
     <w:name w:val="Normal"/>
@@ -4930,7 +4925,7 @@
 </file>
 
 <file path=customXml/itemProps1.xml><?xml version="1.0" encoding="utf-8"?>
-<ds:datastoreItem xmlns:ds="http://schemas.openxmlformats.org/officeDocument/2006/customXml" ds:itemID="{7BA80886-ED9D-4B4B-8D8D-1568C7C853A4}">
+<ds:datastoreItem xmlns:ds="http://schemas.openxmlformats.org/officeDocument/2006/customXml" ds:itemID="{03316506-7579-4F19-9588-937039D21A03}">
   <ds:schemaRefs>
     <ds:schemaRef ds:uri="http://schemas.openxmlformats.org/officeDocument/2006/bibliography"/>
   </ds:schemaRefs>

</xml_diff>